<commit_message>
nmv 29 05 2026
</commit_message>
<xml_diff>
--- a/TS Jatai Ghanam Project/TS 1.4/TS 1.4 Jatai Malayalam Corrections.docx
+++ b/TS Jatai Ghanam Project/TS 1.4/TS 1.4 Jatai Malayalam Corrections.docx
@@ -22,7 +22,18 @@
           <w:szCs w:val="32"/>
           <w:u w:val="single"/>
         </w:rPr>
-        <w:t xml:space="preserve">TS Jatai – TS 1.4 Malayalam Corrections – Observed till </w:t>
+        <w:t xml:space="preserve">TS Jatai – TS 1.4 Malayalam Corrections – Observed </w:t>
+      </w:r>
+      <w:proofErr w:type="gramStart"/>
+      <w:r>
+        <w:rPr>
+          <w:b/>
+          <w:bCs/>
+          <w:sz w:val="32"/>
+          <w:szCs w:val="32"/>
+          <w:u w:val="single"/>
+        </w:rPr>
+        <w:t xml:space="preserve">till </w:t>
       </w:r>
       <w:r>
         <w:rPr>
@@ -30,10 +41,20 @@
           <w:bCs/>
           <w:sz w:val="32"/>
           <w:szCs w:val="32"/>
-          <w:highlight w:val="red"/>
           <w:u w:val="single"/>
         </w:rPr>
-        <w:t>????</w:t>
+        <w:t xml:space="preserve"> 30th  June</w:t>
+      </w:r>
+      <w:proofErr w:type="gramEnd"/>
+      <w:r>
+        <w:rPr>
+          <w:b/>
+          <w:bCs/>
+          <w:sz w:val="32"/>
+          <w:szCs w:val="32"/>
+          <w:u w:val="single"/>
+        </w:rPr>
+        <w:t xml:space="preserve"> 2026</w:t>
       </w:r>
     </w:p>
     <w:p>
@@ -257,8 +278,19 @@
                 <w:sz w:val="32"/>
                 <w:szCs w:val="40"/>
               </w:rPr>
-              <w:t>)-  A</w:t>
-            </w:r>
+              <w:t>)</w:t>
+            </w:r>
+            <w:proofErr w:type="gramStart"/>
+            <w:r>
+              <w:rPr>
+                <w:rFonts w:ascii="BRH Malayalam Extra" w:hAnsi="BRH Malayalam Extra" w:cs="BRH Malayalam Extra"/>
+                <w:color w:val="000000"/>
+                <w:sz w:val="32"/>
+                <w:szCs w:val="40"/>
+              </w:rPr>
+              <w:t>-  A</w:t>
+            </w:r>
+            <w:proofErr w:type="gramEnd"/>
             <w:r>
               <w:rPr>
                 <w:rFonts w:ascii="BRH Malayalam Extra" w:hAnsi="BRH Malayalam Extra" w:cs="BRH Malayalam Extra"/>
@@ -371,16 +403,28 @@
                 <w:sz w:val="32"/>
                 <w:szCs w:val="40"/>
               </w:rPr>
-              <w:t>k¢˜(</w:t>
-            </w:r>
-            <w:r>
-              <w:rPr>
-                <w:rFonts w:cs="BRH Malayalam Extra"/>
+              <w:t>k¢</w:t>
+            </w:r>
+            <w:proofErr w:type="gramStart"/>
+            <w:r>
+              <w:rPr>
+                <w:rFonts w:ascii="BRH Malayalam Extra" w:hAnsi="BRH Malayalam Extra" w:cs="BRH Malayalam Extra"/>
                 <w:color w:val="000000"/>
+                <w:sz w:val="32"/>
+                <w:szCs w:val="40"/>
+              </w:rPr>
+              <w:t>˜(</w:t>
+            </w:r>
+            <w:proofErr w:type="gramEnd"/>
+            <w:r>
+              <w:rPr>
+                <w:rFonts w:cs="BRH Malayalam Extra"/>
+                <w:color w:val="000000"/>
                 <w:szCs w:val="40"/>
               </w:rPr>
               <w:t>1</w:t>
             </w:r>
+            <w:proofErr w:type="gramStart"/>
             <w:r>
               <w:rPr>
                 <w:rFonts w:ascii="BRH Malayalam Extra" w:hAnsi="BRH Malayalam Extra" w:cs="BRH Malayalam Extra"/>
@@ -397,7 +441,17 @@
                 <w:sz w:val="32"/>
                 <w:szCs w:val="40"/>
               </w:rPr>
-              <w:t>)ªp—ræû</w:t>
+              <w:t>)ªp</w:t>
+            </w:r>
+            <w:proofErr w:type="gramEnd"/>
+            <w:r>
+              <w:rPr>
+                <w:rFonts w:ascii="BRH Malayalam Extra" w:hAnsi="BRH Malayalam Extra" w:cs="BRH Malayalam Extra"/>
+                <w:color w:val="000000"/>
+                <w:sz w:val="32"/>
+                <w:szCs w:val="40"/>
+              </w:rPr>
+              <w:t>—ræû</w:t>
             </w:r>
             <w:r>
               <w:rPr>
@@ -919,8 +973,19 @@
                 <w:sz w:val="32"/>
                 <w:szCs w:val="40"/>
               </w:rPr>
-              <w:t>)-  d</w:t>
-            </w:r>
+              <w:t>)</w:t>
+            </w:r>
+            <w:proofErr w:type="gramStart"/>
+            <w:r>
+              <w:rPr>
+                <w:rFonts w:ascii="BRH Malayalam Extra" w:hAnsi="BRH Malayalam Extra" w:cs="BRH Malayalam Extra"/>
+                <w:color w:val="000000"/>
+                <w:sz w:val="32"/>
+                <w:szCs w:val="40"/>
+              </w:rPr>
+              <w:t>-  d</w:t>
+            </w:r>
+            <w:proofErr w:type="gramEnd"/>
             <w:r>
               <w:rPr>
                 <w:rFonts w:ascii="BRH Malayalam Extra" w:hAnsi="BRH Malayalam Extra" w:cs="BRH Malayalam Extra"/>
@@ -1137,8 +1202,19 @@
                 <w:sz w:val="32"/>
                 <w:szCs w:val="40"/>
               </w:rPr>
-              <w:t>)-  d</w:t>
-            </w:r>
+              <w:t>)</w:t>
+            </w:r>
+            <w:proofErr w:type="gramStart"/>
+            <w:r>
+              <w:rPr>
+                <w:rFonts w:ascii="BRH Malayalam Extra" w:hAnsi="BRH Malayalam Extra" w:cs="BRH Malayalam Extra"/>
+                <w:color w:val="000000"/>
+                <w:sz w:val="32"/>
+                <w:szCs w:val="40"/>
+              </w:rPr>
+              <w:t>-  d</w:t>
+            </w:r>
+            <w:proofErr w:type="gramEnd"/>
             <w:r>
               <w:rPr>
                 <w:rFonts w:ascii="BRH Malayalam Extra" w:hAnsi="BRH Malayalam Extra" w:cs="BRH Malayalam Extra"/>
@@ -1288,117 +1364,160 @@
           </w:p>
         </w:tc>
       </w:tr>
-      <w:tr>
-        <w:trPr>
-          <w:trHeight w:val="771"/>
-        </w:trPr>
-        <w:tc>
-          <w:tcPr>
-            <w:tcW w:w="6741" w:type="dxa"/>
-          </w:tcPr>
-          <w:p>
-            <w:pPr>
-              <w:widowControl w:val="0"/>
-              <w:autoSpaceDE w:val="0"/>
-              <w:autoSpaceDN w:val="0"/>
-              <w:adjustRightInd w:val="0"/>
-              <w:spacing w:before="0" w:line="240" w:lineRule="auto"/>
-              <w:rPr>
-                <w:rFonts w:cs="Latha"/>
-                <w:b/>
-                <w:bCs/>
-                <w:szCs w:val="28"/>
-                <w:cs/>
-                <w:lang w:bidi="ta-IN"/>
-              </w:rPr>
-            </w:pPr>
-          </w:p>
-        </w:tc>
-        <w:tc>
-          <w:tcPr>
-            <w:tcW w:w="7655" w:type="dxa"/>
-          </w:tcPr>
-          <w:p>
-            <w:pPr>
-              <w:widowControl w:val="0"/>
-              <w:autoSpaceDE w:val="0"/>
-              <w:autoSpaceDN w:val="0"/>
-              <w:adjustRightInd w:val="0"/>
-              <w:spacing w:before="0" w:line="240" w:lineRule="auto"/>
-              <w:rPr>
-                <w:rFonts w:cs="Latha"/>
-                <w:b/>
-                <w:bCs/>
-                <w:szCs w:val="28"/>
-                <w:cs/>
-                <w:lang w:bidi="ta-IN"/>
-              </w:rPr>
-            </w:pPr>
-          </w:p>
-        </w:tc>
-      </w:tr>
-      <w:tr>
-        <w:trPr>
-          <w:trHeight w:val="771"/>
-        </w:trPr>
-        <w:tc>
-          <w:tcPr>
-            <w:tcW w:w="6741" w:type="dxa"/>
-            <w:tcBorders>
-              <w:top w:val="single" w:sz="4" w:space="0" w:color="000000"/>
-              <w:left w:val="single" w:sz="4" w:space="0" w:color="000000"/>
-              <w:bottom w:val="single" w:sz="4" w:space="0" w:color="000000"/>
-              <w:right w:val="single" w:sz="4" w:space="0" w:color="000000"/>
-            </w:tcBorders>
-          </w:tcPr>
-          <w:p>
-            <w:pPr>
-              <w:widowControl w:val="0"/>
-              <w:autoSpaceDE w:val="0"/>
-              <w:autoSpaceDN w:val="0"/>
-              <w:adjustRightInd w:val="0"/>
-              <w:spacing w:before="0" w:line="240" w:lineRule="auto"/>
-              <w:rPr>
-                <w:rFonts w:cs="Latha"/>
-                <w:b/>
-                <w:bCs/>
-                <w:szCs w:val="28"/>
-                <w:cs/>
-                <w:lang w:bidi="ta-IN"/>
-              </w:rPr>
-            </w:pPr>
-          </w:p>
-        </w:tc>
-        <w:tc>
-          <w:tcPr>
-            <w:tcW w:w="7655" w:type="dxa"/>
-            <w:tcBorders>
-              <w:top w:val="single" w:sz="4" w:space="0" w:color="000000"/>
-              <w:left w:val="single" w:sz="4" w:space="0" w:color="000000"/>
-              <w:bottom w:val="single" w:sz="4" w:space="0" w:color="000000"/>
-              <w:right w:val="single" w:sz="4" w:space="0" w:color="000000"/>
-            </w:tcBorders>
-          </w:tcPr>
-          <w:p>
-            <w:pPr>
-              <w:widowControl w:val="0"/>
-              <w:autoSpaceDE w:val="0"/>
-              <w:autoSpaceDN w:val="0"/>
-              <w:adjustRightInd w:val="0"/>
-              <w:spacing w:before="0" w:line="240" w:lineRule="auto"/>
-              <w:rPr>
-                <w:rFonts w:cs="Latha"/>
-                <w:b/>
-                <w:bCs/>
-                <w:szCs w:val="28"/>
-                <w:cs/>
-                <w:lang w:bidi="ta-IN"/>
-              </w:rPr>
-            </w:pPr>
-          </w:p>
-        </w:tc>
-      </w:tr>
     </w:tbl>
+    <w:p>
+      <w:pPr>
+        <w:spacing w:before="0" w:line="240" w:lineRule="auto"/>
+        <w:jc w:val="center"/>
+        <w:rPr>
+          <w:b/>
+          <w:bCs/>
+          <w:sz w:val="32"/>
+          <w:szCs w:val="32"/>
+          <w:u w:val="single"/>
+        </w:rPr>
+      </w:pPr>
+      <w:r>
+        <w:rPr>
+          <w:b/>
+          <w:bCs/>
+          <w:sz w:val="32"/>
+          <w:szCs w:val="32"/>
+          <w:u w:val="single"/>
+        </w:rPr>
+        <w:t>==========</w:t>
+      </w:r>
+    </w:p>
+    <w:p>
+      <w:pPr>
+        <w:spacing w:before="0" w:line="240" w:lineRule="auto"/>
+        <w:jc w:val="center"/>
+        <w:rPr>
+          <w:b/>
+          <w:bCs/>
+          <w:sz w:val="32"/>
+          <w:szCs w:val="32"/>
+          <w:u w:val="single"/>
+        </w:rPr>
+      </w:pPr>
+    </w:p>
+    <w:p>
+      <w:pPr>
+        <w:spacing w:before="0" w:line="240" w:lineRule="auto"/>
+        <w:jc w:val="center"/>
+        <w:rPr>
+          <w:b/>
+          <w:bCs/>
+          <w:sz w:val="32"/>
+          <w:szCs w:val="32"/>
+          <w:u w:val="single"/>
+        </w:rPr>
+      </w:pPr>
+    </w:p>
+    <w:p>
+      <w:pPr>
+        <w:spacing w:before="0" w:line="240" w:lineRule="auto"/>
+        <w:jc w:val="center"/>
+        <w:rPr>
+          <w:b/>
+          <w:bCs/>
+          <w:sz w:val="32"/>
+          <w:szCs w:val="32"/>
+          <w:u w:val="single"/>
+        </w:rPr>
+      </w:pPr>
+    </w:p>
+    <w:p>
+      <w:pPr>
+        <w:spacing w:before="0" w:line="240" w:lineRule="auto"/>
+        <w:jc w:val="center"/>
+        <w:rPr>
+          <w:b/>
+          <w:bCs/>
+          <w:sz w:val="32"/>
+          <w:szCs w:val="32"/>
+          <w:u w:val="single"/>
+        </w:rPr>
+      </w:pPr>
+    </w:p>
+    <w:p>
+      <w:pPr>
+        <w:spacing w:before="0" w:line="240" w:lineRule="auto"/>
+        <w:jc w:val="center"/>
+        <w:rPr>
+          <w:b/>
+          <w:bCs/>
+          <w:sz w:val="32"/>
+          <w:szCs w:val="32"/>
+          <w:u w:val="single"/>
+        </w:rPr>
+      </w:pPr>
+    </w:p>
+    <w:p>
+      <w:pPr>
+        <w:spacing w:before="0" w:line="240" w:lineRule="auto"/>
+        <w:jc w:val="center"/>
+        <w:rPr>
+          <w:b/>
+          <w:bCs/>
+          <w:sz w:val="32"/>
+          <w:szCs w:val="32"/>
+          <w:u w:val="single"/>
+        </w:rPr>
+      </w:pPr>
+    </w:p>
+    <w:p>
+      <w:pPr>
+        <w:spacing w:before="0" w:line="240" w:lineRule="auto"/>
+        <w:jc w:val="center"/>
+        <w:rPr>
+          <w:b/>
+          <w:bCs/>
+          <w:sz w:val="32"/>
+          <w:szCs w:val="32"/>
+          <w:u w:val="single"/>
+        </w:rPr>
+      </w:pPr>
+    </w:p>
+    <w:p>
+      <w:pPr>
+        <w:spacing w:before="0" w:line="240" w:lineRule="auto"/>
+        <w:jc w:val="center"/>
+        <w:rPr>
+          <w:b/>
+          <w:bCs/>
+          <w:sz w:val="32"/>
+          <w:szCs w:val="32"/>
+          <w:u w:val="single"/>
+        </w:rPr>
+      </w:pPr>
+    </w:p>
+    <w:p>
+      <w:pPr>
+        <w:spacing w:before="0" w:line="240" w:lineRule="auto"/>
+        <w:jc w:val="center"/>
+        <w:rPr>
+          <w:b/>
+          <w:bCs/>
+          <w:sz w:val="32"/>
+          <w:szCs w:val="32"/>
+          <w:u w:val="single"/>
+        </w:rPr>
+      </w:pPr>
+    </w:p>
+    <w:p>
+      <w:pPr>
+        <w:spacing w:before="0" w:line="240" w:lineRule="auto"/>
+        <w:jc w:val="center"/>
+        <w:rPr>
+          <w:b/>
+          <w:bCs/>
+          <w:sz w:val="32"/>
+          <w:szCs w:val="32"/>
+          <w:u w:val="single"/>
+        </w:rPr>
+      </w:pPr>
+    </w:p>
     <w:p>
       <w:pPr>
         <w:spacing w:before="0" w:line="240" w:lineRule="auto"/>
@@ -1445,6 +1564,7 @@
           <w:szCs w:val="32"/>
           <w:u w:val="single"/>
         </w:rPr>
+        <w:lastRenderedPageBreak/>
         <w:t xml:space="preserve">TS </w:t>
       </w:r>
       <w:r>
@@ -1634,7 +1754,6 @@
                 <w:rFonts w:cs="BRH Malayalam Extra"/>
                 <w:szCs w:val="40"/>
               </w:rPr>
-              <w:lastRenderedPageBreak/>
               <w:t>40</w:t>
             </w:r>
             <w:r>
@@ -1726,8 +1845,18 @@
                 <w:sz w:val="32"/>
                 <w:szCs w:val="40"/>
               </w:rPr>
-              <w:t>)-  Zûx</w:t>
-            </w:r>
+              <w:t>)</w:t>
+            </w:r>
+            <w:proofErr w:type="gramStart"/>
+            <w:r>
+              <w:rPr>
+                <w:rFonts w:ascii="BRH Malayalam Extra" w:hAnsi="BRH Malayalam Extra" w:cs="BRH Malayalam Extra"/>
+                <w:sz w:val="32"/>
+                <w:szCs w:val="40"/>
+              </w:rPr>
+              <w:t>-  Zûx</w:t>
+            </w:r>
+            <w:proofErr w:type="gramEnd"/>
             <w:r>
               <w:rPr>
                 <w:rFonts w:ascii="BRH Malayalam Extra" w:hAnsi="BRH Malayalam Extra" w:cs="BRH Malayalam Extra"/>
@@ -2093,7 +2222,25 @@
                 <w:sz w:val="32"/>
                 <w:szCs w:val="40"/>
               </w:rPr>
-              <w:t>)-  s¡</w:t>
+              <w:t>)</w:t>
+            </w:r>
+            <w:proofErr w:type="gramStart"/>
+            <w:r>
+              <w:rPr>
+                <w:rFonts w:ascii="BRH Malayalam Extra" w:hAnsi="BRH Malayalam Extra" w:cs="BRH Malayalam Extra"/>
+                <w:sz w:val="32"/>
+                <w:szCs w:val="40"/>
+              </w:rPr>
+              <w:t>-  s</w:t>
+            </w:r>
+            <w:proofErr w:type="gramEnd"/>
+            <w:r>
+              <w:rPr>
+                <w:rFonts w:ascii="BRH Malayalam Extra" w:hAnsi="BRH Malayalam Extra" w:cs="BRH Malayalam Extra"/>
+                <w:sz w:val="32"/>
+                <w:szCs w:val="40"/>
+              </w:rPr>
+              <w:t>¡</w:t>
             </w:r>
             <w:r>
               <w:rPr>
@@ -2386,7 +2533,25 @@
                 <w:sz w:val="32"/>
                 <w:szCs w:val="40"/>
               </w:rPr>
-              <w:t>)-  s¡</w:t>
+              <w:t>)</w:t>
+            </w:r>
+            <w:proofErr w:type="gramStart"/>
+            <w:r>
+              <w:rPr>
+                <w:rFonts w:ascii="BRH Malayalam Extra" w:hAnsi="BRH Malayalam Extra" w:cs="BRH Malayalam Extra"/>
+                <w:sz w:val="32"/>
+                <w:szCs w:val="40"/>
+              </w:rPr>
+              <w:t>-  s</w:t>
+            </w:r>
+            <w:proofErr w:type="gramEnd"/>
+            <w:r>
+              <w:rPr>
+                <w:rFonts w:ascii="BRH Malayalam Extra" w:hAnsi="BRH Malayalam Extra" w:cs="BRH Malayalam Extra"/>
+                <w:sz w:val="32"/>
+                <w:szCs w:val="40"/>
+              </w:rPr>
+              <w:t>¡</w:t>
             </w:r>
             <w:r>
               <w:rPr>
@@ -2649,8 +2814,18 @@
                 <w:sz w:val="32"/>
                 <w:szCs w:val="40"/>
               </w:rPr>
-              <w:t>)-  Zûx</w:t>
-            </w:r>
+              <w:t>)</w:t>
+            </w:r>
+            <w:proofErr w:type="gramStart"/>
+            <w:r>
+              <w:rPr>
+                <w:rFonts w:ascii="BRH Malayalam Extra" w:hAnsi="BRH Malayalam Extra" w:cs="BRH Malayalam Extra"/>
+                <w:sz w:val="32"/>
+                <w:szCs w:val="40"/>
+              </w:rPr>
+              <w:t>-  Zûx</w:t>
+            </w:r>
+            <w:proofErr w:type="gramEnd"/>
             <w:r>
               <w:rPr>
                 <w:rFonts w:ascii="BRH Malayalam Extra" w:hAnsi="BRH Malayalam Extra" w:cs="BRH Malayalam Extra"/>
@@ -3082,7 +3257,25 @@
                 <w:sz w:val="32"/>
                 <w:szCs w:val="40"/>
               </w:rPr>
-              <w:t>)-  s¡</w:t>
+              <w:t>)</w:t>
+            </w:r>
+            <w:proofErr w:type="gramStart"/>
+            <w:r>
+              <w:rPr>
+                <w:rFonts w:ascii="BRH Malayalam Extra" w:hAnsi="BRH Malayalam Extra" w:cs="BRH Malayalam Extra"/>
+                <w:sz w:val="32"/>
+                <w:szCs w:val="40"/>
+              </w:rPr>
+              <w:t>-  s</w:t>
+            </w:r>
+            <w:proofErr w:type="gramEnd"/>
+            <w:r>
+              <w:rPr>
+                <w:rFonts w:ascii="BRH Malayalam Extra" w:hAnsi="BRH Malayalam Extra" w:cs="BRH Malayalam Extra"/>
+                <w:sz w:val="32"/>
+                <w:szCs w:val="40"/>
+              </w:rPr>
+              <w:t>¡</w:t>
             </w:r>
             <w:r>
               <w:rPr>
@@ -3405,7 +3598,25 @@
                 <w:sz w:val="32"/>
                 <w:szCs w:val="40"/>
               </w:rPr>
-              <w:t>)-  s¡</w:t>
+              <w:t>)</w:t>
+            </w:r>
+            <w:proofErr w:type="gramStart"/>
+            <w:r>
+              <w:rPr>
+                <w:rFonts w:ascii="BRH Malayalam Extra" w:hAnsi="BRH Malayalam Extra" w:cs="BRH Malayalam Extra"/>
+                <w:sz w:val="32"/>
+                <w:szCs w:val="40"/>
+              </w:rPr>
+              <w:t>-  s</w:t>
+            </w:r>
+            <w:proofErr w:type="gramEnd"/>
+            <w:r>
+              <w:rPr>
+                <w:rFonts w:ascii="BRH Malayalam Extra" w:hAnsi="BRH Malayalam Extra" w:cs="BRH Malayalam Extra"/>
+                <w:sz w:val="32"/>
+                <w:szCs w:val="40"/>
+              </w:rPr>
+              <w:t>¡</w:t>
             </w:r>
             <w:r>
               <w:rPr>
@@ -3682,8 +3893,18 @@
                 <w:sz w:val="32"/>
                 <w:szCs w:val="40"/>
               </w:rPr>
-              <w:t>)-  A</w:t>
-            </w:r>
+              <w:t>)</w:t>
+            </w:r>
+            <w:proofErr w:type="gramStart"/>
+            <w:r>
+              <w:rPr>
+                <w:rFonts w:ascii="BRH Malayalam Extra" w:hAnsi="BRH Malayalam Extra" w:cs="BRH Malayalam Extra"/>
+                <w:sz w:val="32"/>
+                <w:szCs w:val="40"/>
+              </w:rPr>
+              <w:t>-  A</w:t>
+            </w:r>
+            <w:proofErr w:type="gramEnd"/>
             <w:r>
               <w:rPr>
                 <w:rFonts w:ascii="BRH Malayalam Extra" w:hAnsi="BRH Malayalam Extra" w:cs="BRH Malayalam Extra"/>
@@ -3776,8 +3997,18 @@
                 <w:sz w:val="32"/>
                 <w:szCs w:val="40"/>
               </w:rPr>
-              <w:t>k¢˜(</w:t>
-            </w:r>
+              <w:t>k¢</w:t>
+            </w:r>
+            <w:proofErr w:type="gramStart"/>
+            <w:r>
+              <w:rPr>
+                <w:rFonts w:ascii="BRH Malayalam Extra" w:hAnsi="BRH Malayalam Extra" w:cs="BRH Malayalam Extra"/>
+                <w:sz w:val="32"/>
+                <w:szCs w:val="40"/>
+              </w:rPr>
+              <w:t>˜(</w:t>
+            </w:r>
+            <w:proofErr w:type="gramEnd"/>
             <w:r>
               <w:rPr>
                 <w:rFonts w:cs="BRH Malayalam Extra"/>
@@ -3785,21 +4016,31 @@
               </w:rPr>
               <w:t>1</w:t>
             </w:r>
-            <w:r>
-              <w:rPr>
-                <w:rFonts w:ascii="BRH Malayalam Extra" w:hAnsi="BRH Malayalam Extra" w:cs="BRH Malayalam Extra"/>
-                <w:sz w:val="25"/>
-                <w:szCs w:val="40"/>
-              </w:rPr>
-              <w:t>–</w:t>
-            </w:r>
-            <w:r>
-              <w:rPr>
-                <w:rFonts w:ascii="BRH Malayalam Extra" w:hAnsi="BRH Malayalam Extra" w:cs="BRH Malayalam Extra"/>
-                <w:sz w:val="32"/>
-                <w:szCs w:val="40"/>
-              </w:rPr>
-              <w:t xml:space="preserve">)ªp—ræûræ¢—k¡ | </w:t>
+            <w:proofErr w:type="gramStart"/>
+            <w:r>
+              <w:rPr>
+                <w:rFonts w:ascii="BRH Malayalam Extra" w:hAnsi="BRH Malayalam Extra" w:cs="BRH Malayalam Extra"/>
+                <w:sz w:val="25"/>
+                <w:szCs w:val="40"/>
+              </w:rPr>
+              <w:t>–</w:t>
+            </w:r>
+            <w:r>
+              <w:rPr>
+                <w:rFonts w:ascii="BRH Malayalam Extra" w:hAnsi="BRH Malayalam Extra" w:cs="BRH Malayalam Extra"/>
+                <w:sz w:val="32"/>
+                <w:szCs w:val="40"/>
+              </w:rPr>
+              <w:t>)ªp</w:t>
+            </w:r>
+            <w:proofErr w:type="gramEnd"/>
+            <w:r>
+              <w:rPr>
+                <w:rFonts w:ascii="BRH Malayalam Extra" w:hAnsi="BRH Malayalam Extra" w:cs="BRH Malayalam Extra"/>
+                <w:sz w:val="32"/>
+                <w:szCs w:val="40"/>
+              </w:rPr>
+              <w:t xml:space="preserve">—ræûræ¢—k¡ | </w:t>
             </w:r>
           </w:p>
         </w:tc>
@@ -3916,8 +4157,18 @@
                 <w:sz w:val="32"/>
                 <w:szCs w:val="40"/>
               </w:rPr>
-              <w:t>)-  A</w:t>
-            </w:r>
+              <w:t>)</w:t>
+            </w:r>
+            <w:proofErr w:type="gramStart"/>
+            <w:r>
+              <w:rPr>
+                <w:rFonts w:ascii="BRH Malayalam Extra" w:hAnsi="BRH Malayalam Extra" w:cs="BRH Malayalam Extra"/>
+                <w:sz w:val="32"/>
+                <w:szCs w:val="40"/>
+              </w:rPr>
+              <w:t>-  A</w:t>
+            </w:r>
+            <w:proofErr w:type="gramEnd"/>
             <w:r>
               <w:rPr>
                 <w:rFonts w:ascii="BRH Malayalam Extra" w:hAnsi="BRH Malayalam Extra" w:cs="BRH Malayalam Extra"/>
@@ -4018,8 +4269,18 @@
                 <w:sz w:val="32"/>
                 <w:szCs w:val="40"/>
               </w:rPr>
-              <w:t>k¢˜(</w:t>
-            </w:r>
+              <w:t>k¢</w:t>
+            </w:r>
+            <w:proofErr w:type="gramStart"/>
+            <w:r>
+              <w:rPr>
+                <w:rFonts w:ascii="BRH Malayalam Extra" w:hAnsi="BRH Malayalam Extra" w:cs="BRH Malayalam Extra"/>
+                <w:sz w:val="32"/>
+                <w:szCs w:val="40"/>
+              </w:rPr>
+              <w:t>˜(</w:t>
+            </w:r>
+            <w:proofErr w:type="gramEnd"/>
             <w:r>
               <w:rPr>
                 <w:rFonts w:cs="BRH Malayalam Extra"/>
@@ -4027,21 +4288,31 @@
               </w:rPr>
               <w:t>1</w:t>
             </w:r>
-            <w:r>
-              <w:rPr>
-                <w:rFonts w:ascii="BRH Malayalam Extra" w:hAnsi="BRH Malayalam Extra" w:cs="BRH Malayalam Extra"/>
-                <w:sz w:val="25"/>
-                <w:szCs w:val="40"/>
-              </w:rPr>
-              <w:t>–</w:t>
-            </w:r>
-            <w:r>
-              <w:rPr>
-                <w:rFonts w:ascii="BRH Malayalam Extra" w:hAnsi="BRH Malayalam Extra" w:cs="BRH Malayalam Extra"/>
-                <w:sz w:val="32"/>
-                <w:szCs w:val="40"/>
-              </w:rPr>
-              <w:t xml:space="preserve">)ªp—ræûræ¢—k¡ | </w:t>
+            <w:proofErr w:type="gramStart"/>
+            <w:r>
+              <w:rPr>
+                <w:rFonts w:ascii="BRH Malayalam Extra" w:hAnsi="BRH Malayalam Extra" w:cs="BRH Malayalam Extra"/>
+                <w:sz w:val="25"/>
+                <w:szCs w:val="40"/>
+              </w:rPr>
+              <w:t>–</w:t>
+            </w:r>
+            <w:r>
+              <w:rPr>
+                <w:rFonts w:ascii="BRH Malayalam Extra" w:hAnsi="BRH Malayalam Extra" w:cs="BRH Malayalam Extra"/>
+                <w:sz w:val="32"/>
+                <w:szCs w:val="40"/>
+              </w:rPr>
+              <w:t>)ªp</w:t>
+            </w:r>
+            <w:proofErr w:type="gramEnd"/>
+            <w:r>
+              <w:rPr>
+                <w:rFonts w:ascii="BRH Malayalam Extra" w:hAnsi="BRH Malayalam Extra" w:cs="BRH Malayalam Extra"/>
+                <w:sz w:val="32"/>
+                <w:szCs w:val="40"/>
+              </w:rPr>
+              <w:t xml:space="preserve">—ræûræ¢—k¡ | </w:t>
             </w:r>
           </w:p>
         </w:tc>
@@ -4163,8 +4434,18 @@
                 <w:sz w:val="32"/>
                 <w:szCs w:val="40"/>
               </w:rPr>
-              <w:t>)-  A</w:t>
-            </w:r>
+              <w:t>)</w:t>
+            </w:r>
+            <w:proofErr w:type="gramStart"/>
+            <w:r>
+              <w:rPr>
+                <w:rFonts w:ascii="BRH Malayalam Extra" w:hAnsi="BRH Malayalam Extra" w:cs="BRH Malayalam Extra"/>
+                <w:sz w:val="32"/>
+                <w:szCs w:val="40"/>
+              </w:rPr>
+              <w:t>-  A</w:t>
+            </w:r>
+            <w:proofErr w:type="gramEnd"/>
             <w:r>
               <w:rPr>
                 <w:rFonts w:ascii="BRH Malayalam Extra" w:hAnsi="BRH Malayalam Extra" w:cs="BRH Malayalam Extra"/>
@@ -4257,8 +4538,18 @@
                 <w:sz w:val="32"/>
                 <w:szCs w:val="40"/>
               </w:rPr>
-              <w:t>¢k¢˜(</w:t>
-            </w:r>
+              <w:t>¢k¢</w:t>
+            </w:r>
+            <w:proofErr w:type="gramStart"/>
+            <w:r>
+              <w:rPr>
+                <w:rFonts w:ascii="BRH Malayalam Extra" w:hAnsi="BRH Malayalam Extra" w:cs="BRH Malayalam Extra"/>
+                <w:sz w:val="32"/>
+                <w:szCs w:val="40"/>
+              </w:rPr>
+              <w:t>˜(</w:t>
+            </w:r>
+            <w:proofErr w:type="gramEnd"/>
             <w:r>
               <w:rPr>
                 <w:rFonts w:cs="BRH Malayalam Extra"/>
@@ -4266,21 +4557,31 @@
               </w:rPr>
               <w:t>1</w:t>
             </w:r>
-            <w:r>
-              <w:rPr>
-                <w:rFonts w:ascii="BRH Malayalam Extra" w:hAnsi="BRH Malayalam Extra" w:cs="BRH Malayalam Extra"/>
-                <w:sz w:val="25"/>
-                <w:szCs w:val="40"/>
-              </w:rPr>
-              <w:t>–</w:t>
-            </w:r>
-            <w:r>
-              <w:rPr>
-                <w:rFonts w:ascii="BRH Malayalam Extra" w:hAnsi="BRH Malayalam Extra" w:cs="BRH Malayalam Extra"/>
-                <w:sz w:val="32"/>
-                <w:szCs w:val="40"/>
-              </w:rPr>
-              <w:t>)ªp—ræûræ¢—k¡ |</w:t>
+            <w:proofErr w:type="gramStart"/>
+            <w:r>
+              <w:rPr>
+                <w:rFonts w:ascii="BRH Malayalam Extra" w:hAnsi="BRH Malayalam Extra" w:cs="BRH Malayalam Extra"/>
+                <w:sz w:val="25"/>
+                <w:szCs w:val="40"/>
+              </w:rPr>
+              <w:t>–</w:t>
+            </w:r>
+            <w:r>
+              <w:rPr>
+                <w:rFonts w:ascii="BRH Malayalam Extra" w:hAnsi="BRH Malayalam Extra" w:cs="BRH Malayalam Extra"/>
+                <w:sz w:val="32"/>
+                <w:szCs w:val="40"/>
+              </w:rPr>
+              <w:t>)ªp</w:t>
+            </w:r>
+            <w:proofErr w:type="gramEnd"/>
+            <w:r>
+              <w:rPr>
+                <w:rFonts w:ascii="BRH Malayalam Extra" w:hAnsi="BRH Malayalam Extra" w:cs="BRH Malayalam Extra"/>
+                <w:sz w:val="32"/>
+                <w:szCs w:val="40"/>
+              </w:rPr>
+              <w:t>—ræûræ¢—k¡ |</w:t>
             </w:r>
           </w:p>
         </w:tc>
@@ -4397,8 +4698,18 @@
                 <w:sz w:val="32"/>
                 <w:szCs w:val="40"/>
               </w:rPr>
-              <w:t>)-  A</w:t>
-            </w:r>
+              <w:t>)</w:t>
+            </w:r>
+            <w:proofErr w:type="gramStart"/>
+            <w:r>
+              <w:rPr>
+                <w:rFonts w:ascii="BRH Malayalam Extra" w:hAnsi="BRH Malayalam Extra" w:cs="BRH Malayalam Extra"/>
+                <w:sz w:val="32"/>
+                <w:szCs w:val="40"/>
+              </w:rPr>
+              <w:t>-  A</w:t>
+            </w:r>
+            <w:proofErr w:type="gramEnd"/>
             <w:r>
               <w:rPr>
                 <w:rFonts w:ascii="BRH Malayalam Extra" w:hAnsi="BRH Malayalam Extra" w:cs="BRH Malayalam Extra"/>
@@ -4500,8 +4811,18 @@
                 <w:sz w:val="32"/>
                 <w:szCs w:val="40"/>
               </w:rPr>
-              <w:t>k¢˜(</w:t>
-            </w:r>
+              <w:t>k¢</w:t>
+            </w:r>
+            <w:proofErr w:type="gramStart"/>
+            <w:r>
+              <w:rPr>
+                <w:rFonts w:ascii="BRH Malayalam Extra" w:hAnsi="BRH Malayalam Extra" w:cs="BRH Malayalam Extra"/>
+                <w:sz w:val="32"/>
+                <w:szCs w:val="40"/>
+              </w:rPr>
+              <w:t>˜(</w:t>
+            </w:r>
+            <w:proofErr w:type="gramEnd"/>
             <w:r>
               <w:rPr>
                 <w:rFonts w:cs="BRH Malayalam Extra"/>
@@ -4509,21 +4830,31 @@
               </w:rPr>
               <w:t>1</w:t>
             </w:r>
-            <w:r>
-              <w:rPr>
-                <w:rFonts w:ascii="BRH Malayalam Extra" w:hAnsi="BRH Malayalam Extra" w:cs="BRH Malayalam Extra"/>
-                <w:sz w:val="25"/>
-                <w:szCs w:val="40"/>
-              </w:rPr>
-              <w:t>–</w:t>
-            </w:r>
-            <w:r>
-              <w:rPr>
-                <w:rFonts w:ascii="BRH Malayalam Extra" w:hAnsi="BRH Malayalam Extra" w:cs="BRH Malayalam Extra"/>
-                <w:sz w:val="32"/>
-                <w:szCs w:val="40"/>
-              </w:rPr>
-              <w:t>)ªp—ræûræ¢—k¡ |</w:t>
+            <w:proofErr w:type="gramStart"/>
+            <w:r>
+              <w:rPr>
+                <w:rFonts w:ascii="BRH Malayalam Extra" w:hAnsi="BRH Malayalam Extra" w:cs="BRH Malayalam Extra"/>
+                <w:sz w:val="25"/>
+                <w:szCs w:val="40"/>
+              </w:rPr>
+              <w:t>–</w:t>
+            </w:r>
+            <w:r>
+              <w:rPr>
+                <w:rFonts w:ascii="BRH Malayalam Extra" w:hAnsi="BRH Malayalam Extra" w:cs="BRH Malayalam Extra"/>
+                <w:sz w:val="32"/>
+                <w:szCs w:val="40"/>
+              </w:rPr>
+              <w:t>)ªp</w:t>
+            </w:r>
+            <w:proofErr w:type="gramEnd"/>
+            <w:r>
+              <w:rPr>
+                <w:rFonts w:ascii="BRH Malayalam Extra" w:hAnsi="BRH Malayalam Extra" w:cs="BRH Malayalam Extra"/>
+                <w:sz w:val="32"/>
+                <w:szCs w:val="40"/>
+              </w:rPr>
+              <w:t>—ræûræ¢—k¡ |</w:t>
             </w:r>
           </w:p>
         </w:tc>
@@ -5276,6 +5607,7 @@
                 <w:rFonts w:cs="BRH Malayalam Extra"/>
                 <w:szCs w:val="40"/>
               </w:rPr>
+              <w:lastRenderedPageBreak/>
               <w:t>23</w:t>
             </w:r>
             <w:r>
@@ -5367,7 +5699,25 @@
                 <w:sz w:val="32"/>
                 <w:szCs w:val="40"/>
               </w:rPr>
-              <w:t>)-  h¢</w:t>
+              <w:t>)</w:t>
+            </w:r>
+            <w:proofErr w:type="gramStart"/>
+            <w:r>
+              <w:rPr>
+                <w:rFonts w:ascii="BRH Malayalam Extra" w:hAnsi="BRH Malayalam Extra" w:cs="BRH Malayalam Extra"/>
+                <w:sz w:val="32"/>
+                <w:szCs w:val="40"/>
+              </w:rPr>
+              <w:t>-  h</w:t>
+            </w:r>
+            <w:proofErr w:type="gramEnd"/>
+            <w:r>
+              <w:rPr>
+                <w:rFonts w:ascii="BRH Malayalam Extra" w:hAnsi="BRH Malayalam Extra" w:cs="BRH Malayalam Extra"/>
+                <w:sz w:val="32"/>
+                <w:szCs w:val="40"/>
+              </w:rPr>
+              <w:t>¢</w:t>
             </w:r>
             <w:r>
               <w:rPr>
@@ -5538,7 +5888,25 @@
                 <w:sz w:val="32"/>
                 <w:szCs w:val="40"/>
               </w:rPr>
-              <w:t>)-  h¢</w:t>
+              <w:t>)</w:t>
+            </w:r>
+            <w:proofErr w:type="gramStart"/>
+            <w:r>
+              <w:rPr>
+                <w:rFonts w:ascii="BRH Malayalam Extra" w:hAnsi="BRH Malayalam Extra" w:cs="BRH Malayalam Extra"/>
+                <w:sz w:val="32"/>
+                <w:szCs w:val="40"/>
+              </w:rPr>
+              <w:t>-  h</w:t>
+            </w:r>
+            <w:proofErr w:type="gramEnd"/>
+            <w:r>
+              <w:rPr>
+                <w:rFonts w:ascii="BRH Malayalam Extra" w:hAnsi="BRH Malayalam Extra" w:cs="BRH Malayalam Extra"/>
+                <w:sz w:val="32"/>
+                <w:szCs w:val="40"/>
+              </w:rPr>
+              <w:t>¢</w:t>
             </w:r>
             <w:r>
               <w:rPr>
@@ -5632,7 +6000,6 @@
                 <w:rFonts w:cs="BRH Malayalam Extra"/>
                 <w:szCs w:val="40"/>
               </w:rPr>
-              <w:lastRenderedPageBreak/>
               <w:t>55</w:t>
             </w:r>
             <w:r>
@@ -5724,8 +6091,18 @@
                 <w:sz w:val="32"/>
                 <w:szCs w:val="40"/>
               </w:rPr>
-              <w:t>)-  A</w:t>
-            </w:r>
+              <w:t>)</w:t>
+            </w:r>
+            <w:proofErr w:type="gramStart"/>
+            <w:r>
+              <w:rPr>
+                <w:rFonts w:ascii="BRH Malayalam Extra" w:hAnsi="BRH Malayalam Extra" w:cs="BRH Malayalam Extra"/>
+                <w:sz w:val="32"/>
+                <w:szCs w:val="40"/>
+              </w:rPr>
+              <w:t>-  A</w:t>
+            </w:r>
+            <w:proofErr w:type="gramEnd"/>
             <w:r>
               <w:rPr>
                 <w:rFonts w:ascii="BRH Malayalam Extra" w:hAnsi="BRH Malayalam Extra" w:cs="BRH Malayalam Extra"/>
@@ -6066,7 +6443,25 @@
                 <w:sz w:val="32"/>
                 <w:szCs w:val="40"/>
               </w:rPr>
-              <w:t>)-  s¡</w:t>
+              <w:t>)</w:t>
+            </w:r>
+            <w:proofErr w:type="gramStart"/>
+            <w:r>
+              <w:rPr>
+                <w:rFonts w:ascii="BRH Malayalam Extra" w:hAnsi="BRH Malayalam Extra" w:cs="BRH Malayalam Extra"/>
+                <w:sz w:val="32"/>
+                <w:szCs w:val="40"/>
+              </w:rPr>
+              <w:t>-  s</w:t>
+            </w:r>
+            <w:proofErr w:type="gramEnd"/>
+            <w:r>
+              <w:rPr>
+                <w:rFonts w:ascii="BRH Malayalam Extra" w:hAnsi="BRH Malayalam Extra" w:cs="BRH Malayalam Extra"/>
+                <w:sz w:val="32"/>
+                <w:szCs w:val="40"/>
+              </w:rPr>
+              <w:t>¡</w:t>
             </w:r>
             <w:r>
               <w:rPr>
@@ -6392,7 +6787,25 @@
                 <w:sz w:val="32"/>
                 <w:szCs w:val="40"/>
               </w:rPr>
-              <w:t>)-  s¡</w:t>
+              <w:t>)</w:t>
+            </w:r>
+            <w:proofErr w:type="gramStart"/>
+            <w:r>
+              <w:rPr>
+                <w:rFonts w:ascii="BRH Malayalam Extra" w:hAnsi="BRH Malayalam Extra" w:cs="BRH Malayalam Extra"/>
+                <w:sz w:val="32"/>
+                <w:szCs w:val="40"/>
+              </w:rPr>
+              <w:t>-  s</w:t>
+            </w:r>
+            <w:proofErr w:type="gramEnd"/>
+            <w:r>
+              <w:rPr>
+                <w:rFonts w:ascii="BRH Malayalam Extra" w:hAnsi="BRH Malayalam Extra" w:cs="BRH Malayalam Extra"/>
+                <w:sz w:val="32"/>
+                <w:szCs w:val="40"/>
+              </w:rPr>
+              <w:t>¡</w:t>
             </w:r>
             <w:r>
               <w:rPr>
@@ -7561,7 +7974,25 @@
                 <w:sz w:val="32"/>
                 <w:szCs w:val="40"/>
               </w:rPr>
-              <w:t>)-  As—Z§ ||</w:t>
+              <w:t>)</w:t>
+            </w:r>
+            <w:proofErr w:type="gramStart"/>
+            <w:r>
+              <w:rPr>
+                <w:rFonts w:ascii="BRH Malayalam Extra" w:hAnsi="BRH Malayalam Extra" w:cs="BRH Malayalam Extra"/>
+                <w:sz w:val="32"/>
+                <w:szCs w:val="40"/>
+              </w:rPr>
+              <w:t>-  As</w:t>
+            </w:r>
+            <w:proofErr w:type="gramEnd"/>
+            <w:r>
+              <w:rPr>
+                <w:rFonts w:ascii="BRH Malayalam Extra" w:hAnsi="BRH Malayalam Extra" w:cs="BRH Malayalam Extra"/>
+                <w:sz w:val="32"/>
+                <w:szCs w:val="40"/>
+              </w:rPr>
+              <w:t>—Z§ ||</w:t>
             </w:r>
           </w:p>
           <w:p>
@@ -7732,7 +8163,25 @@
                 <w:sz w:val="32"/>
                 <w:szCs w:val="40"/>
               </w:rPr>
-              <w:t>)-  As—Z§ ||</w:t>
+              <w:t>)</w:t>
+            </w:r>
+            <w:proofErr w:type="gramStart"/>
+            <w:r>
+              <w:rPr>
+                <w:rFonts w:ascii="BRH Malayalam Extra" w:hAnsi="BRH Malayalam Extra" w:cs="BRH Malayalam Extra"/>
+                <w:sz w:val="32"/>
+                <w:szCs w:val="40"/>
+              </w:rPr>
+              <w:t>-  As</w:t>
+            </w:r>
+            <w:proofErr w:type="gramEnd"/>
+            <w:r>
+              <w:rPr>
+                <w:rFonts w:ascii="BRH Malayalam Extra" w:hAnsi="BRH Malayalam Extra" w:cs="BRH Malayalam Extra"/>
+                <w:sz w:val="32"/>
+                <w:szCs w:val="40"/>
+              </w:rPr>
+              <w:t>—Z§ ||</w:t>
             </w:r>
           </w:p>
           <w:p>
@@ -7908,8 +8357,18 @@
                 <w:sz w:val="32"/>
                 <w:szCs w:val="40"/>
               </w:rPr>
-              <w:t>)-  s</w:t>
-            </w:r>
+              <w:t>)</w:t>
+            </w:r>
+            <w:proofErr w:type="gramStart"/>
+            <w:r>
+              <w:rPr>
+                <w:rFonts w:ascii="BRH Malayalam Extra" w:hAnsi="BRH Malayalam Extra" w:cs="BRH Malayalam Extra"/>
+                <w:sz w:val="32"/>
+                <w:szCs w:val="40"/>
+              </w:rPr>
+              <w:t>-  s</w:t>
+            </w:r>
+            <w:proofErr w:type="gramEnd"/>
             <w:r>
               <w:rPr>
                 <w:rFonts w:ascii="BRH Malayalam Extra" w:hAnsi="BRH Malayalam Extra" w:cs="BRH Malayalam Extra"/>
@@ -8152,8 +8611,18 @@
                 <w:sz w:val="32"/>
                 <w:szCs w:val="40"/>
               </w:rPr>
-              <w:t>)-  s</w:t>
-            </w:r>
+              <w:t>)</w:t>
+            </w:r>
+            <w:proofErr w:type="gramStart"/>
+            <w:r>
+              <w:rPr>
+                <w:rFonts w:ascii="BRH Malayalam Extra" w:hAnsi="BRH Malayalam Extra" w:cs="BRH Malayalam Extra"/>
+                <w:sz w:val="32"/>
+                <w:szCs w:val="40"/>
+              </w:rPr>
+              <w:t>-  s</w:t>
+            </w:r>
+            <w:proofErr w:type="gramEnd"/>
             <w:r>
               <w:rPr>
                 <w:rFonts w:ascii="BRH Malayalam Extra" w:hAnsi="BRH Malayalam Extra" w:cs="BRH Malayalam Extra"/>
@@ -8392,8 +8861,18 @@
                 <w:sz w:val="32"/>
                 <w:szCs w:val="40"/>
               </w:rPr>
-              <w:t>)-  s</w:t>
-            </w:r>
+              <w:t>)</w:t>
+            </w:r>
+            <w:proofErr w:type="gramStart"/>
+            <w:r>
+              <w:rPr>
+                <w:rFonts w:ascii="BRH Malayalam Extra" w:hAnsi="BRH Malayalam Extra" w:cs="BRH Malayalam Extra"/>
+                <w:sz w:val="32"/>
+                <w:szCs w:val="40"/>
+              </w:rPr>
+              <w:t>-  s</w:t>
+            </w:r>
+            <w:proofErr w:type="gramEnd"/>
             <w:r>
               <w:rPr>
                 <w:rFonts w:ascii="BRH Malayalam Extra" w:hAnsi="BRH Malayalam Extra" w:cs="BRH Malayalam Extra"/>
@@ -8635,8 +9114,18 @@
                 <w:sz w:val="32"/>
                 <w:szCs w:val="40"/>
               </w:rPr>
-              <w:t>)-  s</w:t>
-            </w:r>
+              <w:t>)</w:t>
+            </w:r>
+            <w:proofErr w:type="gramStart"/>
+            <w:r>
+              <w:rPr>
+                <w:rFonts w:ascii="BRH Malayalam Extra" w:hAnsi="BRH Malayalam Extra" w:cs="BRH Malayalam Extra"/>
+                <w:sz w:val="32"/>
+                <w:szCs w:val="40"/>
+              </w:rPr>
+              <w:t>-  s</w:t>
+            </w:r>
+            <w:proofErr w:type="gramEnd"/>
             <w:r>
               <w:rPr>
                 <w:rFonts w:ascii="BRH Malayalam Extra" w:hAnsi="BRH Malayalam Extra" w:cs="BRH Malayalam Extra"/>
@@ -8784,6 +9273,7 @@
                 <w:rFonts w:cs="BRH Malayalam Extra"/>
                 <w:szCs w:val="40"/>
               </w:rPr>
+              <w:lastRenderedPageBreak/>
               <w:t>3</w:t>
             </w:r>
             <w:r>
@@ -8875,8 +9365,18 @@
                 <w:sz w:val="32"/>
                 <w:szCs w:val="40"/>
               </w:rPr>
-              <w:t>)-  tx</w:t>
-            </w:r>
+              <w:t>)</w:t>
+            </w:r>
+            <w:proofErr w:type="gramStart"/>
+            <w:r>
+              <w:rPr>
+                <w:rFonts w:ascii="BRH Malayalam Extra" w:hAnsi="BRH Malayalam Extra" w:cs="BRH Malayalam Extra"/>
+                <w:sz w:val="32"/>
+                <w:szCs w:val="40"/>
+              </w:rPr>
+              <w:t>-  tx</w:t>
+            </w:r>
+            <w:proofErr w:type="gramEnd"/>
             <w:r>
               <w:rPr>
                 <w:rFonts w:ascii="BRH Malayalam Extra" w:hAnsi="BRH Malayalam Extra" w:cs="BRH Malayalam Extra"/>
@@ -9095,7 +9595,6 @@
                 <w:sz w:val="32"/>
                 <w:szCs w:val="40"/>
               </w:rPr>
-              <w:lastRenderedPageBreak/>
               <w:t>txky¥jxR</w:t>
             </w:r>
             <w:r>
@@ -9154,7 +9653,6 @@
                 <w:rFonts w:cs="BRH Malayalam Extra"/>
                 <w:szCs w:val="40"/>
               </w:rPr>
-              <w:lastRenderedPageBreak/>
               <w:t>3</w:t>
             </w:r>
             <w:r>
@@ -9246,8 +9744,18 @@
                 <w:sz w:val="32"/>
                 <w:szCs w:val="40"/>
               </w:rPr>
-              <w:t>)-  tx</w:t>
-            </w:r>
+              <w:t>)</w:t>
+            </w:r>
+            <w:proofErr w:type="gramStart"/>
+            <w:r>
+              <w:rPr>
+                <w:rFonts w:ascii="BRH Malayalam Extra" w:hAnsi="BRH Malayalam Extra" w:cs="BRH Malayalam Extra"/>
+                <w:sz w:val="32"/>
+                <w:szCs w:val="40"/>
+              </w:rPr>
+              <w:t>-  tx</w:t>
+            </w:r>
+            <w:proofErr w:type="gramEnd"/>
             <w:r>
               <w:rPr>
                 <w:rFonts w:ascii="BRH Malayalam Extra" w:hAnsi="BRH Malayalam Extra" w:cs="BRH Malayalam Extra"/>
@@ -9482,7 +9990,6 @@
                 <w:sz w:val="32"/>
                 <w:szCs w:val="40"/>
               </w:rPr>
-              <w:lastRenderedPageBreak/>
               <w:t>tx—ky¥jxR</w:t>
             </w:r>
             <w:r>
@@ -9532,7 +10039,6 @@
                 <w:szCs w:val="40"/>
                 <w:lang w:val="it-IT"/>
               </w:rPr>
-              <w:lastRenderedPageBreak/>
               <w:t>12</w:t>
             </w:r>
             <w:r>
@@ -12942,6 +13448,7 @@
                 <w:szCs w:val="40"/>
                 <w:lang w:val="it-IT"/>
               </w:rPr>
+              <w:lastRenderedPageBreak/>
               <w:t>1</w:t>
             </w:r>
             <w:r>
@@ -13639,7 +14146,6 @@
                 <w:szCs w:val="40"/>
                 <w:lang w:val="it-IT"/>
               </w:rPr>
-              <w:lastRenderedPageBreak/>
               <w:t>7</w:t>
             </w:r>
             <w:r>

</xml_diff>